<commit_message>
nmv 02 10 2026
</commit_message>
<xml_diff>
--- a/TS-Kramam/TS-5.2/TS 5.2 Malayalam Krama Paatam Corrections.docx
+++ b/TS-Kramam/TS-5.2/TS 5.2 Malayalam Krama Paatam Corrections.docx
@@ -2373,6 +2373,7 @@
               </w:rPr>
               <w:t>ª</w:t>
             </w:r>
+            <w:proofErr w:type="gramStart"/>
             <w:r>
               <w:rPr>
                 <w:rFonts w:ascii="BRH Malayalam Extra" w:eastAsia="Times New Roman" w:hAnsi="BRH Malayalam Extra" w:cs="BRH Malayalam Extra"/>
@@ -2393,6 +2394,7 @@
               </w:rPr>
               <w:t>.E</w:t>
             </w:r>
+            <w:proofErr w:type="gramEnd"/>
             <w:r>
               <w:rPr>
                 <w:rFonts w:ascii="BRH Malayalam Extra" w:eastAsia="Times New Roman" w:hAnsi="BRH Malayalam Extra" w:cs="BRH Malayalam Extra"/>
@@ -2600,6 +2602,7 @@
               </w:rPr>
               <w:t>ª</w:t>
             </w:r>
+            <w:proofErr w:type="gramStart"/>
             <w:r>
               <w:rPr>
                 <w:rFonts w:ascii="BRH Malayalam Extra" w:eastAsia="Times New Roman" w:hAnsi="BRH Malayalam Extra" w:cs="BRH Malayalam Extra"/>
@@ -2620,6 +2623,7 @@
               </w:rPr>
               <w:t>.E</w:t>
             </w:r>
+            <w:proofErr w:type="gramEnd"/>
             <w:r>
               <w:rPr>
                 <w:rFonts w:ascii="BRH Malayalam Extra" w:eastAsia="Times New Roman" w:hAnsi="BRH Malayalam Extra" w:cs="BRH Malayalam Extra"/>
@@ -5471,6 +5475,437 @@
                 <w:lang w:val="it-IT" w:eastAsia="en-IN" w:bidi="ml-IN"/>
               </w:rPr>
               <w:t>YõI |</w:t>
+            </w:r>
+          </w:p>
+        </w:tc>
+      </w:tr>
+      <w:tr>
+        <w:trPr>
+          <w:trHeight w:val="1685"/>
+        </w:trPr>
+        <w:tc>
+          <w:tcPr>
+            <w:tcW w:w="3906" w:type="dxa"/>
+          </w:tcPr>
+          <w:p>
+            <w:pPr>
+              <w:widowControl w:val="0"/>
+              <w:tabs>
+                <w:tab w:val="left" w:pos="993"/>
+              </w:tabs>
+              <w:autoSpaceDE w:val="0"/>
+              <w:autoSpaceDN w:val="0"/>
+              <w:adjustRightInd w:val="0"/>
+              <w:spacing w:before="0" w:line="240" w:lineRule="auto"/>
+              <w:ind w:right="297"/>
+              <w:rPr>
+                <w:rFonts w:cs="Arial"/>
+                <w:b/>
+                <w:color w:val="EE0000"/>
+                <w:sz w:val="28"/>
+                <w:szCs w:val="32"/>
+              </w:rPr>
+            </w:pPr>
+            <w:r>
+              <w:rPr>
+                <w:rFonts w:cs="Arial"/>
+                <w:b/>
+                <w:color w:val="EE0000"/>
+                <w:sz w:val="28"/>
+                <w:szCs w:val="32"/>
+              </w:rPr>
+              <w:t>T.S.5.2.9.3 – Kramam</w:t>
+            </w:r>
+          </w:p>
+          <w:p>
+            <w:pPr>
+              <w:widowControl w:val="0"/>
+              <w:tabs>
+                <w:tab w:val="left" w:pos="993"/>
+              </w:tabs>
+              <w:autoSpaceDE w:val="0"/>
+              <w:autoSpaceDN w:val="0"/>
+              <w:adjustRightInd w:val="0"/>
+              <w:spacing w:before="0" w:line="240" w:lineRule="auto"/>
+              <w:ind w:right="297"/>
+              <w:rPr>
+                <w:rFonts w:cs="Arial"/>
+                <w:b/>
+                <w:color w:val="EE0000"/>
+                <w:sz w:val="28"/>
+                <w:szCs w:val="32"/>
+                <w:lang w:val="en-IN"/>
+              </w:rPr>
+            </w:pPr>
+            <w:r>
+              <w:rPr>
+                <w:rFonts w:cs="Arial"/>
+                <w:b/>
+                <w:color w:val="EE0000"/>
+                <w:sz w:val="28"/>
+                <w:szCs w:val="32"/>
+                <w:lang w:val="en-IN"/>
+              </w:rPr>
+              <w:t>Krama Vaakyam No.– 42,43</w:t>
+            </w:r>
+          </w:p>
+          <w:p>
+            <w:pPr>
+              <w:widowControl w:val="0"/>
+              <w:tabs>
+                <w:tab w:val="left" w:pos="993"/>
+              </w:tabs>
+              <w:autoSpaceDE w:val="0"/>
+              <w:autoSpaceDN w:val="0"/>
+              <w:adjustRightInd w:val="0"/>
+              <w:spacing w:before="0" w:line="240" w:lineRule="auto"/>
+              <w:ind w:right="297"/>
+              <w:rPr>
+                <w:rFonts w:cs="Arial"/>
+                <w:b/>
+                <w:color w:val="EE0000"/>
+                <w:sz w:val="28"/>
+                <w:szCs w:val="28"/>
+                <w:lang w:val="it-IT"/>
+              </w:rPr>
+            </w:pPr>
+            <w:r>
+              <w:rPr>
+                <w:rFonts w:cs="Arial"/>
+                <w:b/>
+                <w:color w:val="EE0000"/>
+                <w:sz w:val="28"/>
+                <w:szCs w:val="32"/>
+                <w:lang w:val="it-IT"/>
+              </w:rPr>
+              <w:t>Panchaati No</w:t>
+            </w:r>
+            <w:r>
+              <w:rPr>
+                <w:rFonts w:cs="Arial"/>
+                <w:b/>
+                <w:color w:val="EE0000"/>
+                <w:szCs w:val="32"/>
+                <w:lang w:val="it-IT"/>
+              </w:rPr>
+              <w:t xml:space="preserve">. - </w:t>
+            </w:r>
+            <w:r>
+              <w:rPr>
+                <w:rFonts w:cs="Arial"/>
+                <w:b/>
+                <w:color w:val="EE0000"/>
+                <w:sz w:val="28"/>
+                <w:szCs w:val="32"/>
+                <w:lang w:val="it-IT"/>
+              </w:rPr>
+              <w:t>50</w:t>
+            </w:r>
+          </w:p>
+        </w:tc>
+        <w:tc>
+          <w:tcPr>
+            <w:tcW w:w="5103" w:type="dxa"/>
+          </w:tcPr>
+          <w:p>
+            <w:pPr>
+              <w:widowControl w:val="0"/>
+              <w:autoSpaceDE w:val="0"/>
+              <w:autoSpaceDN w:val="0"/>
+              <w:adjustRightInd w:val="0"/>
+              <w:spacing w:line="252" w:lineRule="auto"/>
+              <w:rPr>
+                <w:rFonts w:ascii="BRH Devanagari Extra" w:hAnsi="BRH Devanagari Extra" w:cs="BRH Devanagari Extra"/>
+                <w:color w:val="EE0000"/>
+                <w:sz w:val="40"/>
+                <w:szCs w:val="40"/>
+                <w:lang w:val="it-IT"/>
+              </w:rPr>
+            </w:pPr>
+            <w:r>
+              <w:rPr>
+                <w:rFonts w:ascii="BRH Malayalam Extra" w:eastAsia="Times New Roman" w:hAnsi="BRH Malayalam Extra" w:cs="BRH Malayalam Extra"/>
+                <w:color w:val="EE0000"/>
+                <w:sz w:val="40"/>
+                <w:szCs w:val="40"/>
+                <w:lang w:val="it-IT" w:eastAsia="en-IN" w:bidi="ml-IN"/>
+              </w:rPr>
+              <w:t>D</w:t>
+            </w:r>
+            <w:r>
+              <w:rPr>
+                <w:rFonts w:ascii="BRH Malayalam Extra" w:eastAsia="Times New Roman" w:hAnsi="BRH Malayalam Extra" w:cs="BRH Malayalam Extra"/>
+                <w:color w:val="EE0000"/>
+                <w:sz w:val="32"/>
+                <w:szCs w:val="40"/>
+                <w:lang w:val="it-IT" w:eastAsia="en-IN" w:bidi="ml-IN"/>
+              </w:rPr>
+              <w:t>–</w:t>
+            </w:r>
+            <w:r>
+              <w:rPr>
+                <w:rFonts w:ascii="BRH Malayalam Extra" w:eastAsia="Times New Roman" w:hAnsi="BRH Malayalam Extra" w:cs="BRH Malayalam Extra"/>
+                <w:color w:val="EE0000"/>
+                <w:sz w:val="40"/>
+                <w:szCs w:val="40"/>
+                <w:lang w:val="it-IT" w:eastAsia="en-IN" w:bidi="ml-IN"/>
+              </w:rPr>
+              <w:t>hj</w:t>
+            </w:r>
+            <w:r>
+              <w:rPr>
+                <w:rFonts w:ascii="BRH Malayalam Extra" w:eastAsia="Times New Roman" w:hAnsi="BRH Malayalam Extra" w:cs="BRH Malayalam Extra"/>
+                <w:color w:val="EE0000"/>
+                <w:sz w:val="32"/>
+                <w:szCs w:val="40"/>
+                <w:lang w:val="it-IT" w:eastAsia="en-IN" w:bidi="ml-IN"/>
+              </w:rPr>
+              <w:t>–</w:t>
+            </w:r>
+            <w:r>
+              <w:rPr>
+                <w:rFonts w:ascii="BRH Malayalam Extra" w:eastAsia="Times New Roman" w:hAnsi="BRH Malayalam Extra" w:cs="BRH Malayalam Extra"/>
+                <w:color w:val="EE0000"/>
+                <w:sz w:val="40"/>
+                <w:szCs w:val="40"/>
+                <w:lang w:val="it-IT" w:eastAsia="en-IN" w:bidi="ml-IN"/>
+              </w:rPr>
+              <w:t>sõxp—k¡</w:t>
+            </w:r>
+            <w:r>
+              <w:rPr>
+                <w:rFonts w:ascii="BRH Malayalam Extra" w:eastAsia="Times New Roman" w:hAnsi="BRH Malayalam Extra" w:cs="BRH Malayalam Extra"/>
+                <w:color w:val="EE0000"/>
+                <w:sz w:val="40"/>
+                <w:szCs w:val="40"/>
+                <w:highlight w:val="yellow"/>
+                <w:lang w:val="it-IT" w:eastAsia="en-IN" w:bidi="ml-IN"/>
+              </w:rPr>
+              <w:t>¥Æõ</w:t>
+            </w:r>
+            <w:r>
+              <w:rPr>
+                <w:rFonts w:ascii="BRH Malayalam Extra" w:eastAsia="Times New Roman" w:hAnsi="BRH Malayalam Extra" w:cs="BRH Malayalam Extra"/>
+                <w:color w:val="EE0000"/>
+                <w:sz w:val="40"/>
+                <w:szCs w:val="40"/>
+                <w:lang w:val="it-IT" w:eastAsia="en-IN" w:bidi="ml-IN"/>
+              </w:rPr>
+              <w:t xml:space="preserve"> | Ap—k¡</w:t>
+            </w:r>
+            <w:r>
+              <w:rPr>
+                <w:rFonts w:ascii="BRH Malayalam Extra" w:eastAsia="Times New Roman" w:hAnsi="BRH Malayalam Extra" w:cs="BRH Malayalam Extra"/>
+                <w:color w:val="EE0000"/>
+                <w:sz w:val="40"/>
+                <w:szCs w:val="40"/>
+                <w:highlight w:val="yellow"/>
+                <w:lang w:val="it-IT" w:eastAsia="en-IN" w:bidi="ml-IN"/>
+              </w:rPr>
+              <w:t>¥Æõ</w:t>
+            </w:r>
+            <w:r>
+              <w:rPr>
+                <w:rFonts w:ascii="BRH Malayalam Extra" w:eastAsia="Times New Roman" w:hAnsi="BRH Malayalam Extra" w:cs="BRH Malayalam Extra"/>
+                <w:color w:val="EE0000"/>
+                <w:sz w:val="40"/>
+                <w:szCs w:val="40"/>
+                <w:lang w:val="it-IT" w:eastAsia="en-IN" w:bidi="ml-IN"/>
+              </w:rPr>
+              <w:t xml:space="preserve"> eq¡qz</w:t>
+            </w:r>
+            <w:r>
+              <w:rPr>
+                <w:rFonts w:ascii="BRH Malayalam Extra" w:eastAsia="Times New Roman" w:hAnsi="BRH Malayalam Extra" w:cs="BRH Malayalam Extra"/>
+                <w:color w:val="EE0000"/>
+                <w:sz w:val="32"/>
+                <w:szCs w:val="40"/>
+                <w:lang w:val="it-IT" w:eastAsia="en-IN" w:bidi="ml-IN"/>
+              </w:rPr>
+              <w:t>–</w:t>
+            </w:r>
+            <w:r>
+              <w:rPr>
+                <w:rFonts w:ascii="BRH Malayalam Extra" w:eastAsia="Times New Roman" w:hAnsi="BRH Malayalam Extra" w:cs="BRH Malayalam Extra"/>
+                <w:color w:val="EE0000"/>
+                <w:sz w:val="40"/>
+                <w:szCs w:val="40"/>
+                <w:lang w:val="it-IT" w:eastAsia="en-IN" w:bidi="ml-IN"/>
+              </w:rPr>
+              <w:t>ª.</w:t>
+            </w:r>
+            <w:r>
+              <w:rPr>
+                <w:rFonts w:ascii="BRH Malayalam Extra" w:eastAsia="Times New Roman" w:hAnsi="BRH Malayalam Extra" w:cs="BRH Malayalam Extra"/>
+                <w:color w:val="EE0000"/>
+                <w:sz w:val="32"/>
+                <w:szCs w:val="40"/>
+                <w:lang w:val="it-IT" w:eastAsia="en-IN" w:bidi="ml-IN"/>
+              </w:rPr>
+              <w:t>–</w:t>
+            </w:r>
+            <w:r>
+              <w:rPr>
+                <w:rFonts w:ascii="BRH Malayalam Extra" w:eastAsia="Times New Roman" w:hAnsi="BRH Malayalam Extra" w:cs="BRH Malayalam Extra"/>
+                <w:color w:val="EE0000"/>
+                <w:sz w:val="40"/>
+                <w:szCs w:val="40"/>
+                <w:lang w:val="it-IT" w:eastAsia="en-IN" w:bidi="ml-IN"/>
+              </w:rPr>
+              <w:t>rxYy— |</w:t>
+            </w:r>
+          </w:p>
+        </w:tc>
+        <w:tc>
+          <w:tcPr>
+            <w:tcW w:w="5386" w:type="dxa"/>
+          </w:tcPr>
+          <w:p>
+            <w:pPr>
+              <w:widowControl w:val="0"/>
+              <w:autoSpaceDE w:val="0"/>
+              <w:autoSpaceDN w:val="0"/>
+              <w:adjustRightInd w:val="0"/>
+              <w:spacing w:line="252" w:lineRule="auto"/>
+              <w:rPr>
+                <w:rFonts w:ascii="BRH Devanagari Extra" w:hAnsi="BRH Devanagari Extra" w:cs="BRH Devanagari Extra"/>
+                <w:color w:val="EE0000"/>
+                <w:sz w:val="40"/>
+                <w:szCs w:val="40"/>
+                <w:lang w:val="it-IT"/>
+              </w:rPr>
+            </w:pPr>
+            <w:r>
+              <w:rPr>
+                <w:rFonts w:ascii="BRH Malayalam Extra" w:eastAsia="Times New Roman" w:hAnsi="BRH Malayalam Extra" w:cs="BRH Malayalam Extra"/>
+                <w:color w:val="EE0000"/>
+                <w:sz w:val="40"/>
+                <w:szCs w:val="40"/>
+                <w:lang w:val="it-IT" w:eastAsia="en-IN" w:bidi="ml-IN"/>
+              </w:rPr>
+              <w:t>D</w:t>
+            </w:r>
+            <w:r>
+              <w:rPr>
+                <w:rFonts w:ascii="BRH Malayalam Extra" w:eastAsia="Times New Roman" w:hAnsi="BRH Malayalam Extra" w:cs="BRH Malayalam Extra"/>
+                <w:color w:val="EE0000"/>
+                <w:sz w:val="32"/>
+                <w:szCs w:val="40"/>
+                <w:lang w:val="it-IT" w:eastAsia="en-IN" w:bidi="ml-IN"/>
+              </w:rPr>
+              <w:t>–</w:t>
+            </w:r>
+            <w:r>
+              <w:rPr>
+                <w:rFonts w:ascii="BRH Malayalam Extra" w:eastAsia="Times New Roman" w:hAnsi="BRH Malayalam Extra" w:cs="BRH Malayalam Extra"/>
+                <w:color w:val="EE0000"/>
+                <w:sz w:val="40"/>
+                <w:szCs w:val="40"/>
+                <w:lang w:val="it-IT" w:eastAsia="en-IN" w:bidi="ml-IN"/>
+              </w:rPr>
+              <w:t>hj</w:t>
+            </w:r>
+            <w:r>
+              <w:rPr>
+                <w:rFonts w:ascii="BRH Malayalam Extra" w:eastAsia="Times New Roman" w:hAnsi="BRH Malayalam Extra" w:cs="BRH Malayalam Extra"/>
+                <w:color w:val="EE0000"/>
+                <w:sz w:val="32"/>
+                <w:szCs w:val="40"/>
+                <w:lang w:val="it-IT" w:eastAsia="en-IN" w:bidi="ml-IN"/>
+              </w:rPr>
+              <w:t>–</w:t>
+            </w:r>
+            <w:r>
+              <w:rPr>
+                <w:rFonts w:ascii="BRH Malayalam Extra" w:eastAsia="Times New Roman" w:hAnsi="BRH Malayalam Extra" w:cs="BRH Malayalam Extra"/>
+                <w:color w:val="EE0000"/>
+                <w:sz w:val="40"/>
+                <w:szCs w:val="40"/>
+                <w:lang w:val="it-IT" w:eastAsia="en-IN" w:bidi="ml-IN"/>
+              </w:rPr>
+              <w:t>sõxp—k¡</w:t>
+            </w:r>
+            <w:r>
+              <w:rPr>
+                <w:rFonts w:ascii="BRH Malayalam Extra" w:eastAsia="Times New Roman" w:hAnsi="BRH Malayalam Extra" w:cs="BRH Malayalam Extra"/>
+                <w:color w:val="EE0000"/>
+                <w:sz w:val="40"/>
+                <w:szCs w:val="40"/>
+                <w:highlight w:val="green"/>
+                <w:lang w:val="it-IT" w:eastAsia="en-IN" w:bidi="ml-IN"/>
+              </w:rPr>
+              <w:t>¤¤</w:t>
+            </w:r>
+            <w:r>
+              <w:rPr>
+                <w:rFonts w:ascii="BRH Malayalam Extra" w:eastAsia="Times New Roman" w:hAnsi="BRH Malayalam Extra" w:cs="BRH Malayalam Extra"/>
+                <w:color w:val="EE0000"/>
+                <w:sz w:val="40"/>
+                <w:szCs w:val="40"/>
+                <w:lang w:val="it-IT" w:eastAsia="en-IN" w:bidi="ml-IN"/>
+              </w:rPr>
+              <w:t>Æõ | Ap—k¡</w:t>
+            </w:r>
+            <w:r>
+              <w:rPr>
+                <w:rFonts w:ascii="BRH Malayalam Extra" w:eastAsia="Times New Roman" w:hAnsi="BRH Malayalam Extra" w:cs="BRH Malayalam Extra"/>
+                <w:color w:val="EE0000"/>
+                <w:sz w:val="40"/>
+                <w:szCs w:val="40"/>
+                <w:highlight w:val="green"/>
+                <w:lang w:val="it-IT" w:eastAsia="en-IN" w:bidi="ml-IN"/>
+              </w:rPr>
+              <w:t>¤¤</w:t>
+            </w:r>
+            <w:r>
+              <w:rPr>
+                <w:rFonts w:ascii="BRH Malayalam Extra" w:eastAsia="Times New Roman" w:hAnsi="BRH Malayalam Extra" w:cs="BRH Malayalam Extra"/>
+                <w:color w:val="EE0000"/>
+                <w:sz w:val="40"/>
+                <w:szCs w:val="40"/>
+                <w:lang w:val="it-IT" w:eastAsia="en-IN" w:bidi="ml-IN"/>
+              </w:rPr>
+              <w:t>Æõ eq¡qz</w:t>
+            </w:r>
+            <w:r>
+              <w:rPr>
+                <w:rFonts w:ascii="BRH Malayalam Extra" w:eastAsia="Times New Roman" w:hAnsi="BRH Malayalam Extra" w:cs="BRH Malayalam Extra"/>
+                <w:color w:val="EE0000"/>
+                <w:sz w:val="32"/>
+                <w:szCs w:val="40"/>
+                <w:lang w:val="it-IT" w:eastAsia="en-IN" w:bidi="ml-IN"/>
+              </w:rPr>
+              <w:t>–</w:t>
+            </w:r>
+            <w:r>
+              <w:rPr>
+                <w:rFonts w:ascii="BRH Malayalam Extra" w:eastAsia="Times New Roman" w:hAnsi="BRH Malayalam Extra" w:cs="BRH Malayalam Extra"/>
+                <w:color w:val="EE0000"/>
+                <w:sz w:val="40"/>
+                <w:szCs w:val="40"/>
+                <w:lang w:val="it-IT" w:eastAsia="en-IN" w:bidi="ml-IN"/>
+              </w:rPr>
+              <w:t>ª.</w:t>
+            </w:r>
+            <w:r>
+              <w:rPr>
+                <w:rFonts w:ascii="BRH Malayalam Extra" w:eastAsia="Times New Roman" w:hAnsi="BRH Malayalam Extra" w:cs="BRH Malayalam Extra"/>
+                <w:color w:val="EE0000"/>
+                <w:sz w:val="32"/>
+                <w:szCs w:val="40"/>
+                <w:lang w:val="it-IT" w:eastAsia="en-IN" w:bidi="ml-IN"/>
+              </w:rPr>
+              <w:t>–</w:t>
+            </w:r>
+            <w:r>
+              <w:rPr>
+                <w:rFonts w:ascii="BRH Malayalam Extra" w:eastAsia="Times New Roman" w:hAnsi="BRH Malayalam Extra" w:cs="BRH Malayalam Extra"/>
+                <w:color w:val="EE0000"/>
+                <w:sz w:val="40"/>
+                <w:szCs w:val="40"/>
+                <w:lang w:val="it-IT" w:eastAsia="en-IN" w:bidi="ml-IN"/>
+              </w:rPr>
+              <w:t>rxYy— |</w:t>
             </w:r>
           </w:p>
         </w:tc>
@@ -6834,6 +7269,7 @@
                 <w:sz w:val="28"/>
                 <w:szCs w:val="32"/>
               </w:rPr>
+              <w:lastRenderedPageBreak/>
               <w:t>T.S.5.2.4.2</w:t>
             </w:r>
             <w:r>
@@ -7245,7 +7681,6 @@
                 <w:sz w:val="28"/>
                 <w:szCs w:val="32"/>
               </w:rPr>
-              <w:lastRenderedPageBreak/>
               <w:t>T.S.5.2.5.6</w:t>
             </w:r>
             <w:r>
@@ -9240,6 +9675,7 @@
                 <w:sz w:val="28"/>
                 <w:szCs w:val="32"/>
               </w:rPr>
+              <w:lastRenderedPageBreak/>
               <w:t>T.S.</w:t>
             </w:r>
             <w:r>
@@ -9541,7 +9977,6 @@
                 <w:szCs w:val="40"/>
                 <w:lang w:val="it-IT" w:eastAsia="en-IN" w:bidi="ml-IN"/>
               </w:rPr>
-              <w:lastRenderedPageBreak/>
               <w:t>eky-Bp—ªZ¥Ç |</w:t>
             </w:r>
           </w:p>
@@ -9573,7 +10008,6 @@
                 <w:szCs w:val="40"/>
                 <w:lang w:val="it-IT" w:eastAsia="en-IN" w:bidi="ml-IN"/>
               </w:rPr>
-              <w:lastRenderedPageBreak/>
               <w:t>e</w:t>
             </w:r>
             <w:r>
@@ -9718,7 +10152,6 @@
                 <w:szCs w:val="40"/>
                 <w:lang w:val="it-IT" w:eastAsia="en-IN" w:bidi="ml-IN"/>
               </w:rPr>
-              <w:lastRenderedPageBreak/>
               <w:t>eky-Bp—ªZ¥Ç |</w:t>
             </w:r>
           </w:p>
@@ -9757,7 +10190,6 @@
                 <w:sz w:val="28"/>
                 <w:szCs w:val="32"/>
               </w:rPr>
-              <w:lastRenderedPageBreak/>
               <w:t>T.S.5.2.5.5 – Kramam</w:t>
             </w:r>
           </w:p>
@@ -11708,6 +12140,7 @@
                 <w:sz w:val="28"/>
                 <w:szCs w:val="32"/>
               </w:rPr>
+              <w:lastRenderedPageBreak/>
               <w:t>T.S.5.2.10.1 – Kramam</w:t>
             </w:r>
           </w:p>
@@ -11951,7 +12384,6 @@
                 <w:sz w:val="28"/>
                 <w:szCs w:val="32"/>
               </w:rPr>
-              <w:lastRenderedPageBreak/>
               <w:t>T.S.5.2.11.1 – Kramam</w:t>
             </w:r>
           </w:p>
@@ -12338,7 +12770,16 @@
           <w:bCs/>
           <w:sz w:val="32"/>
         </w:rPr>
-        <w:t>replaced with</w:t>
+        <w:t xml:space="preserve">replaced </w:t>
+      </w:r>
+      <w:proofErr w:type="gramStart"/>
+      <w:r>
+        <w:rPr>
+          <w:b/>
+          <w:bCs/>
+          <w:sz w:val="32"/>
+        </w:rPr>
+        <w:t>with</w:t>
       </w:r>
       <w:r>
         <w:rPr>
@@ -12360,6 +12801,7 @@
         </w:rPr>
         <w:t>"</w:t>
       </w:r>
+      <w:proofErr w:type="gramEnd"/>
       <w:r>
         <w:rPr>
           <w:rFonts w:ascii="BRH Malayalam" w:hAnsi="BRH Malayalam" w:cs="BRH Malayalam"/>
@@ -12371,6 +12813,7 @@
         </w:rPr>
         <w:t>q§T</w:t>
       </w:r>
+      <w:proofErr w:type="gramStart"/>
       <w:r>
         <w:rPr>
           <w:rFonts w:ascii="BRH Malayalam" w:hAnsi="BRH Malayalam" w:cs="BRH Malayalam"/>
@@ -12387,7 +12830,16 @@
           <w:bCs/>
           <w:sz w:val="32"/>
         </w:rPr>
-        <w:t>wherever applicable</w:t>
+        <w:t>wherever</w:t>
+      </w:r>
+      <w:proofErr w:type="gramEnd"/>
+      <w:r>
+        <w:rPr>
+          <w:b/>
+          <w:bCs/>
+          <w:sz w:val="32"/>
+        </w:rPr>
+        <w:t xml:space="preserve"> applicable</w:t>
       </w:r>
     </w:p>
     <w:p>

</xml_diff>

<commit_message>
nmv 04 10 2026
</commit_message>
<xml_diff>
--- a/TS-Kramam/TS-5.2/TS 5.2 Malayalam Krama Paatam Corrections.docx
+++ b/TS-Kramam/TS-5.2/TS 5.2 Malayalam Krama Paatam Corrections.docx
@@ -2279,15 +2279,16 @@
                 <w:color w:val="000000"/>
                 <w:sz w:val="40"/>
                 <w:szCs w:val="40"/>
-              </w:rPr>
-            </w:pPr>
-            <w:r>
-              <w:rPr>
-                <w:rFonts w:ascii="BRH Malayalam Extra" w:eastAsia="Times New Roman" w:hAnsi="BRH Malayalam Extra" w:cs="BRH Malayalam Extra"/>
-                <w:color w:val="000000"/>
-                <w:sz w:val="40"/>
-                <w:szCs w:val="40"/>
-                <w:lang w:eastAsia="en-IN" w:bidi="ml-IN"/>
+                <w:lang w:val="it-IT"/>
+              </w:rPr>
+            </w:pPr>
+            <w:r>
+              <w:rPr>
+                <w:rFonts w:ascii="BRH Malayalam Extra" w:eastAsia="Times New Roman" w:hAnsi="BRH Malayalam Extra" w:cs="BRH Malayalam Extra"/>
+                <w:color w:val="000000"/>
+                <w:sz w:val="40"/>
+                <w:szCs w:val="40"/>
+                <w:lang w:val="it-IT" w:eastAsia="en-IN" w:bidi="ml-IN"/>
               </w:rPr>
               <w:t>Zy</w:t>
             </w:r>
@@ -2297,7 +2298,7 @@
                 <w:color w:val="000000"/>
                 <w:sz w:val="32"/>
                 <w:szCs w:val="40"/>
-                <w:lang w:eastAsia="en-IN" w:bidi="ml-IN"/>
+                <w:lang w:val="it-IT" w:eastAsia="en-IN" w:bidi="ml-IN"/>
               </w:rPr>
               <w:t>–</w:t>
             </w:r>
@@ -2308,7 +2309,7 @@
                 <w:sz w:val="40"/>
                 <w:szCs w:val="40"/>
                 <w:highlight w:val="yellow"/>
-                <w:lang w:eastAsia="en-IN" w:bidi="ml-IN"/>
+                <w:lang w:val="it-IT" w:eastAsia="en-IN" w:bidi="ml-IN"/>
               </w:rPr>
               <w:t>r</w:t>
             </w:r>
@@ -2319,17 +2320,17 @@
                 <w:sz w:val="32"/>
                 <w:szCs w:val="40"/>
                 <w:highlight w:val="yellow"/>
-                <w:lang w:eastAsia="en-IN" w:bidi="ml-IN"/>
-              </w:rPr>
-              <w:t>–</w:t>
-            </w:r>
-            <w:r>
-              <w:rPr>
-                <w:rFonts w:ascii="BRH Malayalam Extra" w:eastAsia="Times New Roman" w:hAnsi="BRH Malayalam Extra" w:cs="BRH Malayalam Extra"/>
-                <w:color w:val="000000"/>
-                <w:sz w:val="40"/>
-                <w:szCs w:val="40"/>
-                <w:lang w:eastAsia="en-IN" w:bidi="ml-IN"/>
+                <w:lang w:val="it-IT" w:eastAsia="en-IN" w:bidi="ml-IN"/>
+              </w:rPr>
+              <w:t>–</w:t>
+            </w:r>
+            <w:r>
+              <w:rPr>
+                <w:rFonts w:ascii="BRH Malayalam Extra" w:eastAsia="Times New Roman" w:hAnsi="BRH Malayalam Extra" w:cs="BRH Malayalam Extra"/>
+                <w:color w:val="000000"/>
+                <w:sz w:val="40"/>
+                <w:szCs w:val="40"/>
+                <w:lang w:val="it-IT" w:eastAsia="en-IN" w:bidi="ml-IN"/>
               </w:rPr>
               <w:t>¥Ç</w:t>
             </w:r>
@@ -2339,17 +2340,17 @@
                 <w:color w:val="000000"/>
                 <w:sz w:val="32"/>
                 <w:szCs w:val="40"/>
-                <w:lang w:eastAsia="en-IN" w:bidi="ml-IN"/>
-              </w:rPr>
-              <w:t>–</w:t>
-            </w:r>
-            <w:r>
-              <w:rPr>
-                <w:rFonts w:ascii="BRH Malayalam Extra" w:eastAsia="Times New Roman" w:hAnsi="BRH Malayalam Extra" w:cs="BRH Malayalam Extra"/>
-                <w:color w:val="000000"/>
-                <w:sz w:val="40"/>
-                <w:szCs w:val="40"/>
-                <w:lang w:eastAsia="en-IN" w:bidi="ml-IN"/>
+                <w:lang w:val="it-IT" w:eastAsia="en-IN" w:bidi="ml-IN"/>
+              </w:rPr>
+              <w:t>–</w:t>
+            </w:r>
+            <w:r>
+              <w:rPr>
+                <w:rFonts w:ascii="BRH Malayalam Extra" w:eastAsia="Times New Roman" w:hAnsi="BRH Malayalam Extra" w:cs="BRH Malayalam Extra"/>
+                <w:color w:val="000000"/>
+                <w:sz w:val="40"/>
+                <w:szCs w:val="40"/>
+                <w:lang w:val="it-IT" w:eastAsia="en-IN" w:bidi="ml-IN"/>
               </w:rPr>
               <w:t xml:space="preserve"> dy</w:t>
             </w:r>
@@ -2359,59 +2360,57 @@
                 <w:color w:val="000000"/>
                 <w:sz w:val="32"/>
                 <w:szCs w:val="40"/>
-                <w:lang w:eastAsia="en-IN" w:bidi="ml-IN"/>
-              </w:rPr>
-              <w:t>–</w:t>
-            </w:r>
-            <w:r>
-              <w:rPr>
-                <w:rFonts w:ascii="BRH Malayalam Extra" w:eastAsia="Times New Roman" w:hAnsi="BRH Malayalam Extra" w:cs="BRH Malayalam Extra"/>
-                <w:color w:val="000000"/>
-                <w:sz w:val="40"/>
-                <w:szCs w:val="40"/>
-                <w:lang w:eastAsia="en-IN" w:bidi="ml-IN"/>
+                <w:lang w:val="it-IT" w:eastAsia="en-IN" w:bidi="ml-IN"/>
+              </w:rPr>
+              <w:t>–</w:t>
+            </w:r>
+            <w:r>
+              <w:rPr>
+                <w:rFonts w:ascii="BRH Malayalam Extra" w:eastAsia="Times New Roman" w:hAnsi="BRH Malayalam Extra" w:cs="BRH Malayalam Extra"/>
+                <w:color w:val="000000"/>
+                <w:sz w:val="40"/>
+                <w:szCs w:val="40"/>
+                <w:lang w:val="it-IT" w:eastAsia="en-IN" w:bidi="ml-IN"/>
               </w:rPr>
               <w:t>ª</w:t>
             </w:r>
-            <w:proofErr w:type="gramStart"/>
-            <w:r>
-              <w:rPr>
-                <w:rFonts w:ascii="BRH Malayalam Extra" w:eastAsia="Times New Roman" w:hAnsi="BRH Malayalam Extra" w:cs="BRH Malayalam Extra"/>
-                <w:color w:val="000000"/>
-                <w:sz w:val="32"/>
-                <w:szCs w:val="40"/>
-                <w:lang w:eastAsia="en-IN" w:bidi="ml-IN"/>
-              </w:rPr>
-              <w:t>–</w:t>
-            </w:r>
-            <w:r>
-              <w:rPr>
-                <w:rFonts w:ascii="BRH Malayalam Extra" w:eastAsia="Times New Roman" w:hAnsi="BRH Malayalam Extra" w:cs="BRH Malayalam Extra"/>
-                <w:color w:val="000000"/>
-                <w:sz w:val="40"/>
-                <w:szCs w:val="40"/>
-                <w:lang w:eastAsia="en-IN" w:bidi="ml-IN"/>
+            <w:r>
+              <w:rPr>
+                <w:rFonts w:ascii="BRH Malayalam Extra" w:eastAsia="Times New Roman" w:hAnsi="BRH Malayalam Extra" w:cs="BRH Malayalam Extra"/>
+                <w:color w:val="000000"/>
+                <w:sz w:val="32"/>
+                <w:szCs w:val="40"/>
+                <w:lang w:val="it-IT" w:eastAsia="en-IN" w:bidi="ml-IN"/>
+              </w:rPr>
+              <w:t>–</w:t>
+            </w:r>
+            <w:r>
+              <w:rPr>
+                <w:rFonts w:ascii="BRH Malayalam Extra" w:eastAsia="Times New Roman" w:hAnsi="BRH Malayalam Extra" w:cs="BRH Malayalam Extra"/>
+                <w:color w:val="000000"/>
+                <w:sz w:val="40"/>
+                <w:szCs w:val="40"/>
+                <w:lang w:val="it-IT" w:eastAsia="en-IN" w:bidi="ml-IN"/>
               </w:rPr>
               <w:t>.E</w:t>
             </w:r>
-            <w:proofErr w:type="gramEnd"/>
-            <w:r>
-              <w:rPr>
-                <w:rFonts w:ascii="BRH Malayalam Extra" w:eastAsia="Times New Roman" w:hAnsi="BRH Malayalam Extra" w:cs="BRH Malayalam Extra"/>
-                <w:color w:val="000000"/>
-                <w:sz w:val="32"/>
-                <w:szCs w:val="40"/>
-                <w:lang w:eastAsia="en-IN" w:bidi="ml-IN"/>
-              </w:rPr>
-              <w:t>–</w:t>
-            </w:r>
-            <w:r>
-              <w:rPr>
-                <w:rFonts w:ascii="BRH Malayalam Extra" w:eastAsia="Times New Roman" w:hAnsi="BRH Malayalam Extra" w:cs="BRH Malayalam Extra"/>
-                <w:color w:val="000000"/>
-                <w:sz w:val="40"/>
-                <w:szCs w:val="40"/>
-                <w:lang w:eastAsia="en-IN" w:bidi="ml-IN"/>
+            <w:r>
+              <w:rPr>
+                <w:rFonts w:ascii="BRH Malayalam Extra" w:eastAsia="Times New Roman" w:hAnsi="BRH Malayalam Extra" w:cs="BRH Malayalam Extra"/>
+                <w:color w:val="000000"/>
+                <w:sz w:val="32"/>
+                <w:szCs w:val="40"/>
+                <w:lang w:val="it-IT" w:eastAsia="en-IN" w:bidi="ml-IN"/>
+              </w:rPr>
+              <w:t>–</w:t>
+            </w:r>
+            <w:r>
+              <w:rPr>
+                <w:rFonts w:ascii="BRH Malayalam Extra" w:eastAsia="Times New Roman" w:hAnsi="BRH Malayalam Extra" w:cs="BRH Malayalam Extra"/>
+                <w:color w:val="000000"/>
+                <w:sz w:val="40"/>
+                <w:szCs w:val="40"/>
+                <w:lang w:val="it-IT" w:eastAsia="en-IN" w:bidi="ml-IN"/>
               </w:rPr>
               <w:t>Zy</w:t>
             </w:r>
@@ -2421,17 +2420,17 @@
                 <w:color w:val="000000"/>
                 <w:sz w:val="32"/>
                 <w:szCs w:val="40"/>
-                <w:lang w:eastAsia="en-IN" w:bidi="ml-IN"/>
-              </w:rPr>
-              <w:t>–</w:t>
-            </w:r>
-            <w:r>
-              <w:rPr>
-                <w:rFonts w:ascii="BRH Malayalam Extra" w:eastAsia="Times New Roman" w:hAnsi="BRH Malayalam Extra" w:cs="BRH Malayalam Extra"/>
-                <w:color w:val="000000"/>
-                <w:sz w:val="40"/>
-                <w:szCs w:val="40"/>
-                <w:lang w:eastAsia="en-IN" w:bidi="ml-IN"/>
+                <w:lang w:val="it-IT" w:eastAsia="en-IN" w:bidi="ml-IN"/>
+              </w:rPr>
+              <w:t>–</w:t>
+            </w:r>
+            <w:r>
+              <w:rPr>
+                <w:rFonts w:ascii="BRH Malayalam Extra" w:eastAsia="Times New Roman" w:hAnsi="BRH Malayalam Extra" w:cs="BRH Malayalam Extra"/>
+                <w:color w:val="000000"/>
+                <w:sz w:val="40"/>
+                <w:szCs w:val="40"/>
+                <w:lang w:val="it-IT" w:eastAsia="en-IN" w:bidi="ml-IN"/>
               </w:rPr>
               <w:t>¥mx</w:t>
             </w:r>
@@ -2441,17 +2440,17 @@
                 <w:color w:val="000000"/>
                 <w:sz w:val="32"/>
                 <w:szCs w:val="40"/>
-                <w:lang w:eastAsia="en-IN" w:bidi="ml-IN"/>
-              </w:rPr>
-              <w:t>–</w:t>
-            </w:r>
-            <w:r>
-              <w:rPr>
-                <w:rFonts w:ascii="BRH Malayalam Extra" w:eastAsia="Times New Roman" w:hAnsi="BRH Malayalam Extra" w:cs="BRH Malayalam Extra"/>
-                <w:color w:val="000000"/>
-                <w:sz w:val="40"/>
-                <w:szCs w:val="40"/>
-                <w:lang w:eastAsia="en-IN" w:bidi="ml-IN"/>
+                <w:lang w:val="it-IT" w:eastAsia="en-IN" w:bidi="ml-IN"/>
+              </w:rPr>
+              <w:t>–</w:t>
+            </w:r>
+            <w:r>
+              <w:rPr>
+                <w:rFonts w:ascii="BRH Malayalam Extra" w:eastAsia="Times New Roman" w:hAnsi="BRH Malayalam Extra" w:cs="BRH Malayalam Extra"/>
+                <w:color w:val="000000"/>
+                <w:sz w:val="40"/>
+                <w:szCs w:val="40"/>
+                <w:lang w:val="it-IT" w:eastAsia="en-IN" w:bidi="ml-IN"/>
               </w:rPr>
               <w:t>¥K |</w:t>
             </w:r>
@@ -6721,6 +6720,434 @@
                 <w:lang w:eastAsia="en-IN" w:bidi="ml-IN"/>
               </w:rPr>
               <w:t>jZ§-ZûI |</w:t>
+            </w:r>
+          </w:p>
+        </w:tc>
+      </w:tr>
+      <w:tr>
+        <w:trPr>
+          <w:trHeight w:val="1044"/>
+        </w:trPr>
+        <w:tc>
+          <w:tcPr>
+            <w:tcW w:w="3906" w:type="dxa"/>
+          </w:tcPr>
+          <w:p>
+            <w:pPr>
+              <w:widowControl w:val="0"/>
+              <w:tabs>
+                <w:tab w:val="left" w:pos="993"/>
+              </w:tabs>
+              <w:autoSpaceDE w:val="0"/>
+              <w:autoSpaceDN w:val="0"/>
+              <w:adjustRightInd w:val="0"/>
+              <w:spacing w:before="0" w:line="240" w:lineRule="auto"/>
+              <w:ind w:right="297"/>
+              <w:rPr>
+                <w:rFonts w:cs="Arial"/>
+                <w:b/>
+                <w:color w:val="EE0000"/>
+                <w:sz w:val="28"/>
+                <w:szCs w:val="32"/>
+              </w:rPr>
+            </w:pPr>
+            <w:r>
+              <w:rPr>
+                <w:rFonts w:cs="Arial"/>
+                <w:b/>
+                <w:color w:val="EE0000"/>
+                <w:sz w:val="28"/>
+                <w:szCs w:val="32"/>
+              </w:rPr>
+              <w:t>T.S.5.2.11.1 – Kramam</w:t>
+            </w:r>
+          </w:p>
+          <w:p>
+            <w:pPr>
+              <w:widowControl w:val="0"/>
+              <w:tabs>
+                <w:tab w:val="left" w:pos="993"/>
+              </w:tabs>
+              <w:autoSpaceDE w:val="0"/>
+              <w:autoSpaceDN w:val="0"/>
+              <w:adjustRightInd w:val="0"/>
+              <w:spacing w:before="0" w:line="240" w:lineRule="auto"/>
+              <w:ind w:right="297"/>
+              <w:rPr>
+                <w:rFonts w:cs="Arial"/>
+                <w:b/>
+                <w:color w:val="EE0000"/>
+                <w:sz w:val="28"/>
+                <w:szCs w:val="32"/>
+                <w:lang w:val="en-IN"/>
+              </w:rPr>
+            </w:pPr>
+            <w:r>
+              <w:rPr>
+                <w:rFonts w:cs="Arial"/>
+                <w:b/>
+                <w:color w:val="EE0000"/>
+                <w:sz w:val="28"/>
+                <w:szCs w:val="32"/>
+                <w:lang w:val="en-IN"/>
+              </w:rPr>
+              <w:t>Krama Vaakyam No.– 39</w:t>
+            </w:r>
+          </w:p>
+          <w:p>
+            <w:pPr>
+              <w:widowControl w:val="0"/>
+              <w:tabs>
+                <w:tab w:val="left" w:pos="993"/>
+              </w:tabs>
+              <w:autoSpaceDE w:val="0"/>
+              <w:autoSpaceDN w:val="0"/>
+              <w:adjustRightInd w:val="0"/>
+              <w:spacing w:before="0" w:line="240" w:lineRule="auto"/>
+              <w:ind w:right="297"/>
+              <w:rPr>
+                <w:rFonts w:cs="Arial"/>
+                <w:b/>
+                <w:color w:val="EE0000"/>
+                <w:sz w:val="28"/>
+                <w:szCs w:val="28"/>
+              </w:rPr>
+            </w:pPr>
+            <w:r>
+              <w:rPr>
+                <w:rFonts w:cs="Arial"/>
+                <w:b/>
+                <w:color w:val="EE0000"/>
+                <w:sz w:val="28"/>
+                <w:szCs w:val="32"/>
+                <w:lang w:val="it-IT"/>
+              </w:rPr>
+              <w:t>Panchaati No</w:t>
+            </w:r>
+            <w:r>
+              <w:rPr>
+                <w:rFonts w:cs="Arial"/>
+                <w:b/>
+                <w:color w:val="EE0000"/>
+                <w:szCs w:val="32"/>
+                <w:lang w:val="it-IT"/>
+              </w:rPr>
+              <w:t xml:space="preserve">. - </w:t>
+            </w:r>
+            <w:r>
+              <w:rPr>
+                <w:rFonts w:cs="Arial"/>
+                <w:b/>
+                <w:color w:val="EE0000"/>
+                <w:sz w:val="28"/>
+                <w:szCs w:val="32"/>
+                <w:lang w:val="it-IT"/>
+              </w:rPr>
+              <w:t>61</w:t>
+            </w:r>
+          </w:p>
+        </w:tc>
+        <w:tc>
+          <w:tcPr>
+            <w:tcW w:w="5103" w:type="dxa"/>
+          </w:tcPr>
+          <w:p>
+            <w:pPr>
+              <w:widowControl w:val="0"/>
+              <w:autoSpaceDE w:val="0"/>
+              <w:autoSpaceDN w:val="0"/>
+              <w:adjustRightInd w:val="0"/>
+              <w:spacing w:before="0" w:line="240" w:lineRule="auto"/>
+              <w:ind w:right="-90"/>
+              <w:rPr>
+                <w:rFonts w:ascii="BRH Malayalam Extra" w:eastAsia="Times New Roman" w:hAnsi="BRH Malayalam Extra" w:cs="BRH Malayalam Extra"/>
+                <w:color w:val="EE0000"/>
+                <w:sz w:val="40"/>
+                <w:szCs w:val="40"/>
+                <w:lang w:val="en-IN" w:eastAsia="en-IN" w:bidi="ml-IN"/>
+              </w:rPr>
+            </w:pPr>
+            <w:r>
+              <w:rPr>
+                <w:rFonts w:ascii="BRH Malayalam Extra" w:eastAsia="Times New Roman" w:hAnsi="BRH Malayalam Extra" w:cs="BRH Malayalam Extra"/>
+                <w:color w:val="EE0000"/>
+                <w:sz w:val="40"/>
+                <w:szCs w:val="40"/>
+                <w:lang w:val="en-IN" w:eastAsia="en-IN" w:bidi="ml-IN"/>
+              </w:rPr>
+              <w:t>¥i</w:t>
+            </w:r>
+            <w:r>
+              <w:rPr>
+                <w:rFonts w:ascii="BRH Malayalam Extra" w:hAnsi="BRH Malayalam Extra" w:cs="BRH Malayalam Extra"/>
+                <w:color w:val="EE0000"/>
+                <w:sz w:val="40"/>
+                <w:szCs w:val="40"/>
+                <w:highlight w:val="yellow"/>
+              </w:rPr>
+              <w:t>Æ</w:t>
+            </w:r>
+            <w:r>
+              <w:rPr>
+                <w:rFonts w:ascii="BRH Malayalam Extra" w:eastAsia="Times New Roman" w:hAnsi="BRH Malayalam Extra" w:cs="BRH Malayalam Extra"/>
+                <w:color w:val="EE0000"/>
+                <w:sz w:val="40"/>
+                <w:szCs w:val="40"/>
+                <w:lang w:val="en-IN" w:eastAsia="en-IN" w:bidi="ml-IN"/>
+              </w:rPr>
+              <w:t>õx— py</w:t>
+            </w:r>
+            <w:r>
+              <w:rPr>
+                <w:rFonts w:ascii="BRH Malayalam Extra" w:eastAsia="Times New Roman" w:hAnsi="BRH Malayalam Extra" w:cs="BRH Malayalam Extra"/>
+                <w:color w:val="EE0000"/>
+                <w:sz w:val="32"/>
+                <w:szCs w:val="40"/>
+                <w:lang w:val="en-IN" w:eastAsia="en-IN" w:bidi="ml-IN"/>
+              </w:rPr>
+              <w:t>–</w:t>
+            </w:r>
+            <w:r>
+              <w:rPr>
+                <w:rFonts w:ascii="BRH Malayalam Extra" w:eastAsia="Times New Roman" w:hAnsi="BRH Malayalam Extra" w:cs="BRH Malayalam Extra"/>
+                <w:color w:val="EE0000"/>
+                <w:sz w:val="40"/>
+                <w:szCs w:val="40"/>
+                <w:lang w:val="en-IN" w:eastAsia="en-IN" w:bidi="ml-IN"/>
+              </w:rPr>
+              <w:t xml:space="preserve">bõ¡Z—J | </w:t>
+            </w:r>
+          </w:p>
+          <w:p>
+            <w:pPr>
+              <w:widowControl w:val="0"/>
+              <w:autoSpaceDE w:val="0"/>
+              <w:autoSpaceDN w:val="0"/>
+              <w:adjustRightInd w:val="0"/>
+              <w:spacing w:before="0" w:line="240" w:lineRule="auto"/>
+              <w:ind w:right="-90"/>
+              <w:rPr>
+                <w:rFonts w:ascii="BRH Devanagari Extra" w:hAnsi="BRH Devanagari Extra" w:cs="BRH Devanagari Extra"/>
+                <w:color w:val="EE0000"/>
+                <w:sz w:val="40"/>
+                <w:szCs w:val="40"/>
+              </w:rPr>
+            </w:pPr>
+            <w:r>
+              <w:rPr>
+                <w:rFonts w:ascii="BRH Malayalam Extra" w:eastAsia="Times New Roman" w:hAnsi="BRH Malayalam Extra" w:cs="BRH Malayalam Extra"/>
+                <w:color w:val="EE0000"/>
+                <w:sz w:val="40"/>
+                <w:szCs w:val="40"/>
+                <w:lang w:val="en-IN" w:eastAsia="en-IN" w:bidi="ml-IN"/>
+              </w:rPr>
+              <w:t>py</w:t>
+            </w:r>
+            <w:r>
+              <w:rPr>
+                <w:rFonts w:ascii="BRH Malayalam Extra" w:eastAsia="Times New Roman" w:hAnsi="BRH Malayalam Extra" w:cs="BRH Malayalam Extra"/>
+                <w:color w:val="EE0000"/>
+                <w:sz w:val="32"/>
+                <w:szCs w:val="40"/>
+                <w:lang w:val="en-IN" w:eastAsia="en-IN" w:bidi="ml-IN"/>
+              </w:rPr>
+              <w:t>–</w:t>
+            </w:r>
+            <w:r>
+              <w:rPr>
+                <w:rFonts w:ascii="BRH Malayalam Extra" w:eastAsia="Times New Roman" w:hAnsi="BRH Malayalam Extra" w:cs="BRH Malayalam Extra"/>
+                <w:color w:val="EE0000"/>
+                <w:sz w:val="40"/>
+                <w:szCs w:val="40"/>
+                <w:lang w:val="en-IN" w:eastAsia="en-IN" w:bidi="ml-IN"/>
+              </w:rPr>
+              <w:t>bõ¡¥Zx</w:t>
+            </w:r>
+            <w:r>
+              <w:rPr>
+                <w:rFonts w:ascii="BRH Malayalam Extra" w:eastAsia="Times New Roman" w:hAnsi="BRH Malayalam Extra" w:cs="BRH Malayalam Extra"/>
+                <w:color w:val="EE0000"/>
+                <w:sz w:val="32"/>
+                <w:szCs w:val="40"/>
+                <w:lang w:val="en-IN" w:eastAsia="en-IN" w:bidi="ml-IN"/>
+              </w:rPr>
+              <w:t>–</w:t>
+            </w:r>
+            <w:r>
+              <w:rPr>
+                <w:rFonts w:ascii="BRH Malayalam Extra" w:eastAsia="Times New Roman" w:hAnsi="BRH Malayalam Extra" w:cs="BRH Malayalam Extra"/>
+                <w:color w:val="EE0000"/>
+                <w:sz w:val="40"/>
+                <w:szCs w:val="40"/>
+                <w:lang w:val="en-IN" w:eastAsia="en-IN" w:bidi="ml-IN"/>
+              </w:rPr>
+              <w:t xml:space="preserve"> pxP—J |</w:t>
+            </w:r>
+          </w:p>
+        </w:tc>
+        <w:tc>
+          <w:tcPr>
+            <w:tcW w:w="5386" w:type="dxa"/>
+          </w:tcPr>
+          <w:p>
+            <w:pPr>
+              <w:widowControl w:val="0"/>
+              <w:autoSpaceDE w:val="0"/>
+              <w:autoSpaceDN w:val="0"/>
+              <w:adjustRightInd w:val="0"/>
+              <w:spacing w:line="252" w:lineRule="auto"/>
+              <w:rPr>
+                <w:rFonts w:ascii="BRH Malayalam Extra" w:eastAsia="Times New Roman" w:hAnsi="BRH Malayalam Extra" w:cs="BRH Malayalam Extra"/>
+                <w:color w:val="EE0000"/>
+                <w:sz w:val="40"/>
+                <w:szCs w:val="40"/>
+                <w:lang w:val="en-IN" w:eastAsia="en-IN" w:bidi="ml-IN"/>
+              </w:rPr>
+            </w:pPr>
+            <w:r>
+              <w:rPr>
+                <w:rFonts w:ascii="BRH Malayalam Extra" w:eastAsia="Times New Roman" w:hAnsi="BRH Malayalam Extra" w:cs="BRH Malayalam Extra"/>
+                <w:color w:val="EE0000"/>
+                <w:sz w:val="40"/>
+                <w:szCs w:val="40"/>
+                <w:lang w:val="en-IN" w:eastAsia="en-IN" w:bidi="ml-IN"/>
+              </w:rPr>
+              <w:t>¥i</w:t>
+            </w:r>
+            <w:r>
+              <w:rPr>
+                <w:rFonts w:ascii="BRH Malayalam Extra" w:hAnsi="BRH Malayalam Extra" w:cs="BRH Malayalam Extra"/>
+                <w:color w:val="EE0000"/>
+                <w:sz w:val="40"/>
+                <w:szCs w:val="40"/>
+                <w:highlight w:val="green"/>
+              </w:rPr>
+              <w:t>N</w:t>
+            </w:r>
+            <w:r>
+              <w:rPr>
+                <w:rFonts w:ascii="BRH Malayalam Extra" w:eastAsia="Times New Roman" w:hAnsi="BRH Malayalam Extra" w:cs="BRH Malayalam Extra"/>
+                <w:color w:val="EE0000"/>
+                <w:sz w:val="40"/>
+                <w:szCs w:val="40"/>
+                <w:highlight w:val="green"/>
+                <w:lang w:val="en-IN" w:eastAsia="en-IN" w:bidi="ml-IN"/>
+              </w:rPr>
+              <w:t>õx—</w:t>
+            </w:r>
+            <w:r>
+              <w:rPr>
+                <w:rFonts w:ascii="BRH Malayalam Extra" w:eastAsia="Times New Roman" w:hAnsi="BRH Malayalam Extra" w:cs="BRH Malayalam Extra"/>
+                <w:color w:val="EE0000"/>
+                <w:sz w:val="40"/>
+                <w:szCs w:val="40"/>
+                <w:lang w:val="en-IN" w:eastAsia="en-IN" w:bidi="ml-IN"/>
+              </w:rPr>
+              <w:t xml:space="preserve"> py</w:t>
+            </w:r>
+            <w:r>
+              <w:rPr>
+                <w:rFonts w:ascii="BRH Malayalam Extra" w:eastAsia="Times New Roman" w:hAnsi="BRH Malayalam Extra" w:cs="BRH Malayalam Extra"/>
+                <w:color w:val="EE0000"/>
+                <w:sz w:val="32"/>
+                <w:szCs w:val="40"/>
+                <w:lang w:val="en-IN" w:eastAsia="en-IN" w:bidi="ml-IN"/>
+              </w:rPr>
+              <w:t>–</w:t>
+            </w:r>
+            <w:r>
+              <w:rPr>
+                <w:rFonts w:ascii="BRH Malayalam Extra" w:eastAsia="Times New Roman" w:hAnsi="BRH Malayalam Extra" w:cs="BRH Malayalam Extra"/>
+                <w:color w:val="EE0000"/>
+                <w:sz w:val="40"/>
+                <w:szCs w:val="40"/>
+                <w:lang w:val="en-IN" w:eastAsia="en-IN" w:bidi="ml-IN"/>
+              </w:rPr>
+              <w:t xml:space="preserve">bõ¡Z—J | </w:t>
+            </w:r>
+          </w:p>
+          <w:p>
+            <w:pPr>
+              <w:widowControl w:val="0"/>
+              <w:autoSpaceDE w:val="0"/>
+              <w:autoSpaceDN w:val="0"/>
+              <w:adjustRightInd w:val="0"/>
+              <w:spacing w:before="0" w:line="240" w:lineRule="auto"/>
+              <w:ind w:right="-90"/>
+              <w:rPr>
+                <w:rFonts w:ascii="BRH Devanagari Extra" w:hAnsi="BRH Devanagari Extra" w:cs="BRH Devanagari Extra"/>
+                <w:color w:val="EE0000"/>
+                <w:sz w:val="40"/>
+                <w:szCs w:val="40"/>
+              </w:rPr>
+            </w:pPr>
+            <w:r>
+              <w:rPr>
+                <w:rFonts w:ascii="BRH Malayalam Extra" w:eastAsia="Times New Roman" w:hAnsi="BRH Malayalam Extra" w:cs="BRH Malayalam Extra"/>
+                <w:color w:val="EE0000"/>
+                <w:sz w:val="40"/>
+                <w:szCs w:val="40"/>
+                <w:lang w:val="en-IN" w:eastAsia="en-IN" w:bidi="ml-IN"/>
+              </w:rPr>
+              <w:t>py</w:t>
+            </w:r>
+            <w:r>
+              <w:rPr>
+                <w:rFonts w:ascii="BRH Malayalam Extra" w:eastAsia="Times New Roman" w:hAnsi="BRH Malayalam Extra" w:cs="BRH Malayalam Extra"/>
+                <w:color w:val="EE0000"/>
+                <w:sz w:val="32"/>
+                <w:szCs w:val="40"/>
+                <w:lang w:val="en-IN" w:eastAsia="en-IN" w:bidi="ml-IN"/>
+              </w:rPr>
+              <w:t>–</w:t>
+            </w:r>
+            <w:r>
+              <w:rPr>
+                <w:rFonts w:ascii="BRH Malayalam Extra" w:eastAsia="Times New Roman" w:hAnsi="BRH Malayalam Extra" w:cs="BRH Malayalam Extra"/>
+                <w:color w:val="EE0000"/>
+                <w:sz w:val="40"/>
+                <w:szCs w:val="40"/>
+                <w:lang w:val="en-IN" w:eastAsia="en-IN" w:bidi="ml-IN"/>
+              </w:rPr>
+              <w:t>bõ¡¥Zx</w:t>
+            </w:r>
+            <w:r>
+              <w:rPr>
+                <w:rFonts w:ascii="BRH Malayalam Extra" w:eastAsia="Times New Roman" w:hAnsi="BRH Malayalam Extra" w:cs="BRH Malayalam Extra"/>
+                <w:color w:val="EE0000"/>
+                <w:sz w:val="32"/>
+                <w:szCs w:val="40"/>
+                <w:lang w:val="en-IN" w:eastAsia="en-IN" w:bidi="ml-IN"/>
+              </w:rPr>
+              <w:t>–</w:t>
+            </w:r>
+            <w:r>
+              <w:rPr>
+                <w:rFonts w:ascii="BRH Malayalam Extra" w:eastAsia="Times New Roman" w:hAnsi="BRH Malayalam Extra" w:cs="BRH Malayalam Extra"/>
+                <w:color w:val="EE0000"/>
+                <w:sz w:val="40"/>
+                <w:szCs w:val="40"/>
+                <w:lang w:val="en-IN" w:eastAsia="en-IN" w:bidi="ml-IN"/>
+              </w:rPr>
+              <w:t xml:space="preserve"> pxP—J |</w:t>
+            </w:r>
+            <w:r>
+              <w:rPr>
+                <w:rFonts w:cs="Arial"/>
+                <w:color w:val="EE0000"/>
+                <w:sz w:val="40"/>
+                <w:szCs w:val="40"/>
+              </w:rPr>
+              <w:t xml:space="preserve"> </w:t>
+            </w:r>
+            <w:r>
+              <w:rPr>
+                <w:rFonts w:cs="Arial"/>
+                <w:color w:val="EE0000"/>
+                <w:sz w:val="40"/>
+                <w:szCs w:val="40"/>
+              </w:rPr>
+              <w:t>(it is gha)</w:t>
             </w:r>
           </w:p>
         </w:tc>
@@ -6949,6 +7376,7 @@
                 <w:sz w:val="32"/>
                 <w:szCs w:val="32"/>
               </w:rPr>
+              <w:lastRenderedPageBreak/>
               <w:t>Reference</w:t>
             </w:r>
           </w:p>
@@ -6973,6 +7401,7 @@
                 <w:sz w:val="32"/>
                 <w:szCs w:val="32"/>
               </w:rPr>
+              <w:lastRenderedPageBreak/>
               <w:t>As Printed</w:t>
             </w:r>
           </w:p>
@@ -7269,7 +7698,6 @@
                 <w:sz w:val="28"/>
                 <w:szCs w:val="32"/>
               </w:rPr>
-              <w:lastRenderedPageBreak/>
               <w:t>T.S.5.2.4.2</w:t>
             </w:r>
             <w:r>
@@ -9161,6 +9589,7 @@
                 <w:sz w:val="28"/>
                 <w:szCs w:val="32"/>
               </w:rPr>
+              <w:lastRenderedPageBreak/>
               <w:t>T.S.5.2.1.6 – Kramam</w:t>
             </w:r>
           </w:p>
@@ -9675,7 +10104,6 @@
                 <w:sz w:val="28"/>
                 <w:szCs w:val="32"/>
               </w:rPr>
-              <w:lastRenderedPageBreak/>
               <w:t>T.S.</w:t>
             </w:r>
             <w:r>
@@ -11517,6 +11945,7 @@
                 <w:szCs w:val="40"/>
                 <w:lang w:val="en-IN" w:eastAsia="en-IN" w:bidi="ml-IN"/>
               </w:rPr>
+              <w:lastRenderedPageBreak/>
               <w:t>öex</w:t>
             </w:r>
             <w:r>
@@ -11579,6 +12008,7 @@
                 <w:szCs w:val="40"/>
                 <w:lang w:val="en-IN" w:eastAsia="en-IN" w:bidi="ml-IN"/>
               </w:rPr>
+              <w:lastRenderedPageBreak/>
               <w:t>M£</w:t>
             </w:r>
             <w:r>
@@ -11684,6 +12114,7 @@
                 <w:szCs w:val="40"/>
                 <w:lang w:val="en-IN" w:eastAsia="en-IN" w:bidi="ml-IN"/>
               </w:rPr>
+              <w:lastRenderedPageBreak/>
               <w:t>öex</w:t>
             </w:r>
             <w:r>
@@ -11751,6 +12182,7 @@
                 <w:sz w:val="28"/>
                 <w:szCs w:val="32"/>
               </w:rPr>
+              <w:lastRenderedPageBreak/>
               <w:t>T.S.5.2.9.2 – Kramam</w:t>
             </w:r>
           </w:p>
@@ -12140,7 +12572,6 @@
                 <w:sz w:val="28"/>
                 <w:szCs w:val="32"/>
               </w:rPr>
-              <w:lastRenderedPageBreak/>
               <w:t>T.S.5.2.10.1 – Kramam</w:t>
             </w:r>
           </w:p>
@@ -13240,6 +13671,7 @@
           <w:b/>
           <w:sz w:val="32"/>
         </w:rPr>
+        <w:lastRenderedPageBreak/>
         <w:t>===================</w:t>
       </w:r>
     </w:p>

</xml_diff>